<commit_message>
Them trang Diem tot (ca lop va phu huynh), cap nhat danh sach mon theo CT 2018
- Trang Diem tot theo tuan/thang: can bo lop + GVCN xem ca lop (hoc sinh x mon), phu huynh chi xem con minh
- O chon mon theo chuong trinh hien hanh, them mon khac cua truong (cau hinh MonKhac) va nhap tay
- Chuan hoa ten mon viet tat; cap nhat tai lieu chuc nang

Co-Authored-By: Claude Sonnet 5.5 <noreply@anthropic.com>
</commit_message>
<xml_diff>
--- a/tai-lieu/CHUC-NANG-NGAN-GON.docx
+++ b/tai-lieu/CHUC-NANG-NGAN-GON.docx
@@ -851,7 +851,7 @@
                 <w:sz w:val="21"/>
                 <w:szCs w:val="21"/>
               </w:rPr>
-              <w:t xml:space="preserve">Nhận xét</w:t>
+              <w:t xml:space="preserve">Điểm tốt của con</w:t>
             </w:r>
           </w:p>
         </w:tc>
@@ -883,7 +883,7 @@
                 <w:sz w:val="21"/>
                 <w:szCs w:val="21"/>
               </w:rPr>
-              <w:t xml:space="preserve">Đọc ghi chú của cô và cán bộ lớp trong bảng xếp loại tháng.</w:t>
+              <w:t xml:space="preserve">Xem điểm tốt (10, 9, 8) của riêng con theo từng môn, theo tuần hoặc theo tháng; không thấy bạn khác.</w:t>
             </w:r>
           </w:p>
         </w:tc>
@@ -983,40 +983,6 @@
                 <w:szCs w:val="24"/>
               </w:rPr>
               <w:t xml:space="preserve"/>
-            </w:r>
-          </w:p>
-        </w:tc>
-      </w:tr>
-      <w:tr>
-        <w:tc>
-          <w:tcPr>
-            <w:tcW w:type="dxa" w:w="9638"/>
-            <w:gridSpan w:val="5"/>
-            <w:tcBorders>
-              <w:top w:val="single" w:color="999999" w:sz="4"/>
-              <w:left w:val="single" w:color="999999" w:sz="4"/>
-              <w:bottom w:val="single" w:color="999999" w:sz="4"/>
-              <w:right w:val="single" w:color="999999" w:sz="4"/>
-            </w:tcBorders>
-            <w:shd w:fill="EEEEF8" w:color="auto" w:val="clear"/>
-            <w:tcMar>
-              <w:top w:type="dxa" w:w="60"/>
-              <w:left w:type="dxa" w:w="90"/>
-              <w:bottom w:type="dxa" w:w="60"/>
-              <w:right w:type="dxa" w:w="90"/>
-            </w:tcMar>
-          </w:tcPr>
-          <w:p>
-            <w:r>
-              <w:rPr>
-                <w:rFonts w:ascii="Times New Roman" w:cs="Times New Roman" w:eastAsia="Times New Roman" w:hAnsi="Times New Roman"/>
-                <w:b/>
-                <w:bCs/>
-                <w:color w:val="3B3FD8"/>
-                <w:sz w:val="23"/>
-                <w:szCs w:val="23"/>
-              </w:rPr>
-              <w:t xml:space="preserve">Theo dõi cả lớp</w:t>
             </w:r>
           </w:p>
         </w:tc>
@@ -1053,7 +1019,7 @@
                 <w:sz w:val="21"/>
                 <w:szCs w:val="21"/>
               </w:rPr>
-              <w:t xml:space="preserve">Bảng lớp</w:t>
+              <w:t xml:space="preserve">Nhận xét</w:t>
             </w:r>
           </w:p>
         </w:tc>
@@ -1085,7 +1051,7 @@
                 <w:sz w:val="21"/>
                 <w:szCs w:val="21"/>
               </w:rPr>
-              <w:t xml:space="preserve">Xếp loại cả lớp theo tháng, thống kê Tốt/Khá/Đạt/Chưa đạt, tìm theo tên.</w:t>
+              <w:t xml:space="preserve">Đọc ghi chú của cô và cán bộ lớp trong bảng xếp loại tháng.</w:t>
             </w:r>
           </w:p>
         </w:tc>
@@ -1118,6 +1084,39 @@
                 <w:sz w:val="24"/>
                 <w:szCs w:val="24"/>
               </w:rPr>
+              <w:t xml:space="preserve">✓</w:t>
+            </w:r>
+          </w:p>
+        </w:tc>
+        <w:tc>
+          <w:tcPr>
+            <w:tcW w:type="dxa" w:w="950"/>
+            <w:tcBorders>
+              <w:top w:val="single" w:color="999999" w:sz="4"/>
+              <w:left w:val="single" w:color="999999" w:sz="4"/>
+              <w:bottom w:val="single" w:color="999999" w:sz="4"/>
+              <w:right w:val="single" w:color="999999" w:sz="4"/>
+            </w:tcBorders>
+            <w:tcMar>
+              <w:top w:type="dxa" w:w="50"/>
+              <w:left w:type="dxa" w:w="90"/>
+              <w:bottom w:type="dxa" w:w="50"/>
+              <w:right w:type="dxa" w:w="90"/>
+            </w:tcMar>
+          </w:tcPr>
+          <w:p>
+            <w:pPr>
+              <w:jc w:val="center"/>
+            </w:pPr>
+            <w:r>
+              <w:rPr>
+                <w:rFonts w:ascii="Times New Roman" w:cs="Times New Roman" w:eastAsia="Times New Roman" w:hAnsi="Times New Roman"/>
+                <w:b/>
+                <w:bCs/>
+                <w:color w:val="12935A"/>
+                <w:sz w:val="24"/>
+                <w:szCs w:val="24"/>
+              </w:rPr>
               <w:t xml:space="preserve"/>
             </w:r>
           </w:p>
@@ -1151,40 +1150,41 @@
                 <w:sz w:val="24"/>
                 <w:szCs w:val="24"/>
               </w:rPr>
-              <w:t xml:space="preserve">✓</w:t>
-            </w:r>
-          </w:p>
-        </w:tc>
-        <w:tc>
-          <w:tcPr>
-            <w:tcW w:type="dxa" w:w="950"/>
-            <w:tcBorders>
-              <w:top w:val="single" w:color="999999" w:sz="4"/>
-              <w:left w:val="single" w:color="999999" w:sz="4"/>
-              <w:bottom w:val="single" w:color="999999" w:sz="4"/>
-              <w:right w:val="single" w:color="999999" w:sz="4"/>
-            </w:tcBorders>
-            <w:tcMar>
-              <w:top w:type="dxa" w:w="50"/>
-              <w:left w:type="dxa" w:w="90"/>
-              <w:bottom w:type="dxa" w:w="50"/>
-              <w:right w:type="dxa" w:w="90"/>
-            </w:tcMar>
-          </w:tcPr>
-          <w:p>
-            <w:pPr>
-              <w:jc w:val="center"/>
-            </w:pPr>
-            <w:r>
-              <w:rPr>
-                <w:rFonts w:ascii="Times New Roman" w:cs="Times New Roman" w:eastAsia="Times New Roman" w:hAnsi="Times New Roman"/>
-                <w:b/>
-                <w:bCs/>
-                <w:color w:val="12935A"/>
-                <w:sz w:val="24"/>
-                <w:szCs w:val="24"/>
-              </w:rPr>
-              <w:t xml:space="preserve">✓</w:t>
+              <w:t xml:space="preserve"/>
+            </w:r>
+          </w:p>
+        </w:tc>
+      </w:tr>
+      <w:tr>
+        <w:tc>
+          <w:tcPr>
+            <w:tcW w:type="dxa" w:w="9638"/>
+            <w:gridSpan w:val="5"/>
+            <w:tcBorders>
+              <w:top w:val="single" w:color="999999" w:sz="4"/>
+              <w:left w:val="single" w:color="999999" w:sz="4"/>
+              <w:bottom w:val="single" w:color="999999" w:sz="4"/>
+              <w:right w:val="single" w:color="999999" w:sz="4"/>
+            </w:tcBorders>
+            <w:shd w:fill="EEEEF8" w:color="auto" w:val="clear"/>
+            <w:tcMar>
+              <w:top w:type="dxa" w:w="60"/>
+              <w:left w:type="dxa" w:w="90"/>
+              <w:bottom w:type="dxa" w:w="60"/>
+              <w:right w:type="dxa" w:w="90"/>
+            </w:tcMar>
+          </w:tcPr>
+          <w:p>
+            <w:r>
+              <w:rPr>
+                <w:rFonts w:ascii="Times New Roman" w:cs="Times New Roman" w:eastAsia="Times New Roman" w:hAnsi="Times New Roman"/>
+                <w:b/>
+                <w:bCs/>
+                <w:color w:val="3B3FD8"/>
+                <w:sz w:val="23"/>
+                <w:szCs w:val="23"/>
+              </w:rPr>
+              <w:t xml:space="preserve">Theo dõi cả lớp</w:t>
             </w:r>
           </w:p>
         </w:tc>
@@ -1221,7 +1221,7 @@
                 <w:sz w:val="21"/>
                 <w:szCs w:val="21"/>
               </w:rPr>
-              <w:t xml:space="preserve">Chi tiết học sinh</w:t>
+              <w:t xml:space="preserve">Bảng lớp</w:t>
             </w:r>
           </w:p>
         </w:tc>
@@ -1253,7 +1253,7 @@
                 <w:sz w:val="21"/>
                 <w:szCs w:val="21"/>
               </w:rPr>
-              <w:t xml:space="preserve">Xem từng lượt cộng/trừ, xếp loại các tháng của bất kỳ học sinh nào.</w:t>
+              <w:t xml:space="preserve">Xếp loại cả lớp theo tháng, thống kê Tốt/Khá/Đạt/Chưa đạt, tìm theo tên.</w:t>
             </w:r>
           </w:p>
         </w:tc>
@@ -1389,7 +1389,7 @@
                 <w:sz w:val="21"/>
                 <w:szCs w:val="21"/>
               </w:rPr>
-              <w:t xml:space="preserve">Xếp hạng</w:t>
+              <w:t xml:space="preserve">Chi tiết học sinh</w:t>
             </w:r>
           </w:p>
         </w:tc>
@@ -1421,7 +1421,7 @@
                 <w:sz w:val="21"/>
                 <w:szCs w:val="21"/>
               </w:rPr>
-              <w:t xml:space="preserve">Bảng xếp hạng điểm thi đua theo tuần hoặc theo tháng, top 3 vinh danh.</w:t>
+              <w:t xml:space="preserve">Xem từng lượt cộng/trừ, xếp loại các tháng của bất kỳ học sinh nào.</w:t>
             </w:r>
           </w:p>
         </w:tc>
@@ -1557,7 +1557,7 @@
                 <w:sz w:val="21"/>
                 <w:szCs w:val="21"/>
               </w:rPr>
-              <w:t xml:space="preserve">Tổng quan</w:t>
+              <w:t xml:space="preserve">Xếp hạng</w:t>
             </w:r>
           </w:p>
         </w:tc>
@@ -1589,7 +1589,7 @@
                 <w:sz w:val="21"/>
                 <w:szCs w:val="21"/>
               </w:rPr>
-              <w:t xml:space="preserve">Thống kê mọi lỗi trong tuần hoặc tháng (ngày 1 → cuối tháng): lỗi theo nhóm, lỗi phổ biến, theo học sinh, từng lượt.</w:t>
+              <w:t xml:space="preserve">Bảng xếp hạng điểm thi đua theo tuần hoặc theo tháng, top 3 vinh danh.</w:t>
             </w:r>
           </w:p>
         </w:tc>
@@ -1689,40 +1689,6 @@
                 <w:szCs w:val="24"/>
               </w:rPr>
               <w:t xml:space="preserve">✓</w:t>
-            </w:r>
-          </w:p>
-        </w:tc>
-      </w:tr>
-      <w:tr>
-        <w:tc>
-          <w:tcPr>
-            <w:tcW w:type="dxa" w:w="9638"/>
-            <w:gridSpan w:val="5"/>
-            <w:tcBorders>
-              <w:top w:val="single" w:color="999999" w:sz="4"/>
-              <w:left w:val="single" w:color="999999" w:sz="4"/>
-              <w:bottom w:val="single" w:color="999999" w:sz="4"/>
-              <w:right w:val="single" w:color="999999" w:sz="4"/>
-            </w:tcBorders>
-            <w:shd w:fill="EEEEF8" w:color="auto" w:val="clear"/>
-            <w:tcMar>
-              <w:top w:type="dxa" w:w="60"/>
-              <w:left w:type="dxa" w:w="90"/>
-              <w:bottom w:type="dxa" w:w="60"/>
-              <w:right w:type="dxa" w:w="90"/>
-            </w:tcMar>
-          </w:tcPr>
-          <w:p>
-            <w:r>
-              <w:rPr>
-                <w:rFonts w:ascii="Times New Roman" w:cs="Times New Roman" w:eastAsia="Times New Roman" w:hAnsi="Times New Roman"/>
-                <w:b/>
-                <w:bCs/>
-                <w:color w:val="3B3FD8"/>
-                <w:sz w:val="23"/>
-                <w:szCs w:val="23"/>
-              </w:rPr>
-              <w:t xml:space="preserve">Ghi sổ và đánh giá</w:t>
             </w:r>
           </w:p>
         </w:tc>
@@ -1759,7 +1725,7 @@
                 <w:sz w:val="21"/>
                 <w:szCs w:val="21"/>
               </w:rPr>
-              <w:t xml:space="preserve">Sổ thi đua</w:t>
+              <w:t xml:space="preserve">Tổng quan</w:t>
             </w:r>
           </w:p>
         </w:tc>
@@ -1791,7 +1757,7 @@
                 <w:sz w:val="21"/>
                 <w:szCs w:val="21"/>
               </w:rPr>
-              <w:t xml:space="preserve">Chép lỗi / điểm cộng hằng ngày cho từng học sinh; web tự cộng trừ điểm. Xoá mục ghi nhầm (cán bộ lớp trong 7 ngày).</w:t>
+              <w:t xml:space="preserve">Thống kê mọi lỗi trong tuần hoặc tháng (ngày 1 → cuối tháng): lỗi theo nhóm, lỗi phổ biến, theo học sinh, từng lượt.</w:t>
             </w:r>
           </w:p>
         </w:tc>
@@ -1927,7 +1893,7 @@
                 <w:sz w:val="21"/>
                 <w:szCs w:val="21"/>
               </w:rPr>
-              <w:t xml:space="preserve">Trang tuần</w:t>
+              <w:t xml:space="preserve">Điểm tốt cả lớp</w:t>
             </w:r>
           </w:p>
         </w:tc>
@@ -1959,7 +1925,7 @@
                 <w:sz w:val="21"/>
                 <w:szCs w:val="21"/>
               </w:rPr>
-              <w:t xml:space="preserve">Tạo, sửa, xoá trang cho từng tuần học (tuần nghỉ thì bỏ qua).</w:t>
+              <w:t xml:space="preserve">Tổng quan điểm 10 / 9 / 8 của toàn lớp theo từng môn, theo tuần hoặc tháng; bảng học sinh × môn.</w:t>
             </w:r>
           </w:p>
         </w:tc>
@@ -2059,6 +2025,40 @@
                 <w:szCs w:val="24"/>
               </w:rPr>
               <w:t xml:space="preserve">✓</w:t>
+            </w:r>
+          </w:p>
+        </w:tc>
+      </w:tr>
+      <w:tr>
+        <w:tc>
+          <w:tcPr>
+            <w:tcW w:type="dxa" w:w="9638"/>
+            <w:gridSpan w:val="5"/>
+            <w:tcBorders>
+              <w:top w:val="single" w:color="999999" w:sz="4"/>
+              <w:left w:val="single" w:color="999999" w:sz="4"/>
+              <w:bottom w:val="single" w:color="999999" w:sz="4"/>
+              <w:right w:val="single" w:color="999999" w:sz="4"/>
+            </w:tcBorders>
+            <w:shd w:fill="EEEEF8" w:color="auto" w:val="clear"/>
+            <w:tcMar>
+              <w:top w:type="dxa" w:w="60"/>
+              <w:left w:type="dxa" w:w="90"/>
+              <w:bottom w:type="dxa" w:w="60"/>
+              <w:right w:type="dxa" w:w="90"/>
+            </w:tcMar>
+          </w:tcPr>
+          <w:p>
+            <w:r>
+              <w:rPr>
+                <w:rFonts w:ascii="Times New Roman" w:cs="Times New Roman" w:eastAsia="Times New Roman" w:hAnsi="Times New Roman"/>
+                <w:b/>
+                <w:bCs/>
+                <w:color w:val="3B3FD8"/>
+                <w:sz w:val="23"/>
+                <w:szCs w:val="23"/>
+              </w:rPr>
+              <w:t xml:space="preserve">Ghi sổ và đánh giá</w:t>
             </w:r>
           </w:p>
         </w:tc>
@@ -2095,7 +2095,7 @@
                 <w:sz w:val="21"/>
                 <w:szCs w:val="21"/>
               </w:rPr>
-              <w:t xml:space="preserve">Chọn xếp loại tháng</w:t>
+              <w:t xml:space="preserve">Sổ thi đua</w:t>
             </w:r>
           </w:p>
         </w:tc>
@@ -2127,7 +2127,7 @@
                 <w:sz w:val="21"/>
                 <w:szCs w:val="21"/>
               </w:rPr>
-              <w:t xml:space="preserve">Chọn Tốt/Khá/Đạt/Chưa đạt cho từng bạn, có nút điền theo gợi ý của máy.</w:t>
+              <w:t xml:space="preserve">Chép lỗi / điểm cộng (kèm môn học theo chương trình hiện hành, có chọn môn khác) hằng ngày cho từng học sinh; web tự cộng trừ điểm. Xoá mục ghi nhầm (cán bộ lớp trong 7 ngày).</w:t>
             </w:r>
           </w:p>
         </w:tc>
@@ -2263,7 +2263,7 @@
                 <w:sz w:val="21"/>
                 <w:szCs w:val="21"/>
               </w:rPr>
-              <w:t xml:space="preserve">Đánh giá tháng</w:t>
+              <w:t xml:space="preserve">Trang tuần</w:t>
             </w:r>
           </w:p>
         </w:tc>
@@ -2295,7 +2295,7 @@
                 <w:sz w:val="21"/>
                 <w:szCs w:val="21"/>
               </w:rPr>
-              <w:t xml:space="preserve">Bảng giống mẫu của trường: toàn bộ lỗi trong tháng, tự điền kết quả và ghi chú.</w:t>
+              <w:t xml:space="preserve">Tạo, sửa, xoá trang cho từng tuần học (tuần nghỉ thì bỏ qua).</w:t>
             </w:r>
           </w:p>
         </w:tc>
@@ -2431,7 +2431,7 @@
                 <w:sz w:val="21"/>
                 <w:szCs w:val="21"/>
               </w:rPr>
-              <w:t xml:space="preserve">Xuất Excel một tháng</w:t>
+              <w:t xml:space="preserve">Chọn xếp loại tháng</w:t>
             </w:r>
           </w:p>
         </w:tc>
@@ -2463,7 +2463,7 @@
                 <w:sz w:val="21"/>
                 <w:szCs w:val="21"/>
               </w:rPr>
-              <w:t xml:space="preserve">Tải file Excel đúng bố cục mẫu của trường cho tháng đang xem.</w:t>
+              <w:t xml:space="preserve">Chọn Tốt/Khá/Đạt/Chưa đạt cho từng bạn, có nút điền theo gợi ý của máy.</w:t>
             </w:r>
           </w:p>
         </w:tc>
@@ -2563,40 +2563,6 @@
                 <w:szCs w:val="24"/>
               </w:rPr>
               <w:t xml:space="preserve">✓</w:t>
-            </w:r>
-          </w:p>
-        </w:tc>
-      </w:tr>
-      <w:tr>
-        <w:tc>
-          <w:tcPr>
-            <w:tcW w:type="dxa" w:w="9638"/>
-            <w:gridSpan w:val="5"/>
-            <w:tcBorders>
-              <w:top w:val="single" w:color="999999" w:sz="4"/>
-              <w:left w:val="single" w:color="999999" w:sz="4"/>
-              <w:bottom w:val="single" w:color="999999" w:sz="4"/>
-              <w:right w:val="single" w:color="999999" w:sz="4"/>
-            </w:tcBorders>
-            <w:shd w:fill="EEEEF8" w:color="auto" w:val="clear"/>
-            <w:tcMar>
-              <w:top w:type="dxa" w:w="60"/>
-              <w:left w:type="dxa" w:w="90"/>
-              <w:bottom w:type="dxa" w:w="60"/>
-              <w:right w:type="dxa" w:w="90"/>
-            </w:tcMar>
-          </w:tcPr>
-          <w:p>
-            <w:r>
-              <w:rPr>
-                <w:rFonts w:ascii="Times New Roman" w:cs="Times New Roman" w:eastAsia="Times New Roman" w:hAnsi="Times New Roman"/>
-                <w:b/>
-                <w:bCs/>
-                <w:color w:val="3B3FD8"/>
-                <w:sz w:val="23"/>
-                <w:szCs w:val="23"/>
-              </w:rPr>
-              <w:t xml:space="preserve">Quản trị (chỉ GVCN)</w:t>
             </w:r>
           </w:p>
         </w:tc>
@@ -2633,7 +2599,7 @@
                 <w:sz w:val="21"/>
                 <w:szCs w:val="21"/>
               </w:rPr>
-              <w:t xml:space="preserve">Chốt / mở chốt tháng</w:t>
+              <w:t xml:space="preserve">Đánh giá tháng</w:t>
             </w:r>
           </w:p>
         </w:tc>
@@ -2665,7 +2631,7 @@
                 <w:sz w:val="21"/>
                 <w:szCs w:val="21"/>
               </w:rPr>
-              <w:t xml:space="preserve">Khoá tháng đã xong, không ai sửa được nữa; mở lại khi cần.</w:t>
+              <w:t xml:space="preserve">Bảng giống mẫu của trường: toàn bộ lỗi trong tháng, tự điền kết quả và ghi chú.</w:t>
             </w:r>
           </w:p>
         </w:tc>
@@ -2731,7 +2697,7 @@
                 <w:sz w:val="24"/>
                 <w:szCs w:val="24"/>
               </w:rPr>
-              <w:t xml:space="preserve"/>
+              <w:t xml:space="preserve">✓</w:t>
             </w:r>
           </w:p>
         </w:tc>
@@ -2801,7 +2767,7 @@
                 <w:sz w:val="21"/>
                 <w:szCs w:val="21"/>
               </w:rPr>
-              <w:t xml:space="preserve">Xuất Excel cả năm</w:t>
+              <w:t xml:space="preserve">Xuất Excel một tháng</w:t>
             </w:r>
           </w:p>
         </w:tc>
@@ -2833,7 +2799,7 @@
                 <w:sz w:val="21"/>
                 <w:szCs w:val="21"/>
               </w:rPr>
-              <w:t xml:space="preserve">Tải file gồm tất cả các tháng cùng HK1, HK2 theo mẫu của trường.</w:t>
+              <w:t xml:space="preserve">Tải file Excel đúng bố cục mẫu của trường cho tháng đang xem.</w:t>
             </w:r>
           </w:p>
         </w:tc>
@@ -2899,7 +2865,7 @@
                 <w:sz w:val="24"/>
                 <w:szCs w:val="24"/>
               </w:rPr>
-              <w:t xml:space="preserve"/>
+              <w:t xml:space="preserve">✓</w:t>
             </w:r>
           </w:p>
         </w:tc>
@@ -2933,6 +2899,40 @@
                 <w:szCs w:val="24"/>
               </w:rPr>
               <w:t xml:space="preserve">✓</w:t>
+            </w:r>
+          </w:p>
+        </w:tc>
+      </w:tr>
+      <w:tr>
+        <w:tc>
+          <w:tcPr>
+            <w:tcW w:type="dxa" w:w="9638"/>
+            <w:gridSpan w:val="5"/>
+            <w:tcBorders>
+              <w:top w:val="single" w:color="999999" w:sz="4"/>
+              <w:left w:val="single" w:color="999999" w:sz="4"/>
+              <w:bottom w:val="single" w:color="999999" w:sz="4"/>
+              <w:right w:val="single" w:color="999999" w:sz="4"/>
+            </w:tcBorders>
+            <w:shd w:fill="EEEEF8" w:color="auto" w:val="clear"/>
+            <w:tcMar>
+              <w:top w:type="dxa" w:w="60"/>
+              <w:left w:type="dxa" w:w="90"/>
+              <w:bottom w:type="dxa" w:w="60"/>
+              <w:right w:type="dxa" w:w="90"/>
+            </w:tcMar>
+          </w:tcPr>
+          <w:p>
+            <w:r>
+              <w:rPr>
+                <w:rFonts w:ascii="Times New Roman" w:cs="Times New Roman" w:eastAsia="Times New Roman" w:hAnsi="Times New Roman"/>
+                <w:b/>
+                <w:bCs/>
+                <w:color w:val="3B3FD8"/>
+                <w:sz w:val="23"/>
+                <w:szCs w:val="23"/>
+              </w:rPr>
+              <w:t xml:space="preserve">Quản trị (chỉ GVCN)</w:t>
             </w:r>
           </w:p>
         </w:tc>
@@ -2969,7 +2969,7 @@
                 <w:sz w:val="21"/>
                 <w:szCs w:val="21"/>
               </w:rPr>
-              <w:t xml:space="preserve">Học sinh</w:t>
+              <w:t xml:space="preserve">Chốt / mở chốt tháng</w:t>
             </w:r>
           </w:p>
         </w:tc>
@@ -3001,7 +3001,7 @@
                 <w:sz w:val="21"/>
                 <w:szCs w:val="21"/>
               </w:rPr>
-              <w:t xml:space="preserve">Thêm danh sách lớp, sửa họ tên / chức vụ, đánh dấu bạn nghỉ hoặc chuyển.</w:t>
+              <w:t xml:space="preserve">Khoá tháng đã xong, không ai sửa được nữa; mở lại khi cần.</w:t>
             </w:r>
           </w:p>
         </w:tc>
@@ -3137,7 +3137,7 @@
                 <w:sz w:val="21"/>
                 <w:szCs w:val="21"/>
               </w:rPr>
-              <w:t xml:space="preserve">Tài khoản</w:t>
+              <w:t xml:space="preserve">Xuất Excel cả năm</w:t>
             </w:r>
           </w:p>
         </w:tc>
@@ -3169,7 +3169,7 @@
                 <w:sz w:val="21"/>
                 <w:szCs w:val="21"/>
               </w:rPr>
-              <w:t xml:space="preserve">Tạo tài khoản phụ huynh cả lớp, in bảng phát; thêm cán bộ lớp; sửa; khoá / mở khoá.</w:t>
+              <w:t xml:space="preserve">Tải file gồm tất cả các tháng cùng HK1, HK2 theo mẫu của trường.</w:t>
             </w:r>
           </w:p>
         </w:tc>
@@ -3305,7 +3305,7 @@
                 <w:sz w:val="21"/>
                 <w:szCs w:val="21"/>
               </w:rPr>
-              <w:t xml:space="preserve">Đặt lại mật khẩu</w:t>
+              <w:t xml:space="preserve">Học sinh</w:t>
             </w:r>
           </w:p>
         </w:tc>
@@ -3337,7 +3337,7 @@
                 <w:sz w:val="21"/>
                 <w:szCs w:val="21"/>
               </w:rPr>
-              <w:t xml:space="preserve">Đặt lại mật khẩu cho mọi tài khoản khác khi quên.</w:t>
+              <w:t xml:space="preserve">Thêm danh sách lớp, sửa họ tên / chức vụ, đánh dấu bạn nghỉ hoặc chuyển.</w:t>
             </w:r>
           </w:p>
         </w:tc>
@@ -3473,7 +3473,7 @@
                 <w:sz w:val="21"/>
                 <w:szCs w:val="21"/>
               </w:rPr>
-              <w:t xml:space="preserve">Cấu hình</w:t>
+              <w:t xml:space="preserve">Tài khoản</w:t>
             </w:r>
           </w:p>
         </w:tc>
@@ -3505,7 +3505,343 @@
                 <w:sz w:val="21"/>
                 <w:szCs w:val="21"/>
               </w:rPr>
-              <w:t xml:space="preserve">Đổi ngưỡng điểm, trần ghi sổ, học kỳ, năm học…; số liệu tự cập nhật theo.</w:t>
+              <w:t xml:space="preserve">Tạo tài khoản phụ huynh cả lớp, in bảng phát; thêm cán bộ lớp; sửa; khoá / mở khoá.</w:t>
+            </w:r>
+          </w:p>
+        </w:tc>
+        <w:tc>
+          <w:tcPr>
+            <w:tcW w:type="dxa" w:w="900"/>
+            <w:tcBorders>
+              <w:top w:val="single" w:color="999999" w:sz="4"/>
+              <w:left w:val="single" w:color="999999" w:sz="4"/>
+              <w:bottom w:val="single" w:color="999999" w:sz="4"/>
+              <w:right w:val="single" w:color="999999" w:sz="4"/>
+            </w:tcBorders>
+            <w:tcMar>
+              <w:top w:type="dxa" w:w="50"/>
+              <w:left w:type="dxa" w:w="90"/>
+              <w:bottom w:type="dxa" w:w="50"/>
+              <w:right w:type="dxa" w:w="90"/>
+            </w:tcMar>
+          </w:tcPr>
+          <w:p>
+            <w:pPr>
+              <w:jc w:val="center"/>
+            </w:pPr>
+            <w:r>
+              <w:rPr>
+                <w:rFonts w:ascii="Times New Roman" w:cs="Times New Roman" w:eastAsia="Times New Roman" w:hAnsi="Times New Roman"/>
+                <w:b/>
+                <w:bCs/>
+                <w:color w:val="12935A"/>
+                <w:sz w:val="24"/>
+                <w:szCs w:val="24"/>
+              </w:rPr>
+              <w:t xml:space="preserve"/>
+            </w:r>
+          </w:p>
+        </w:tc>
+        <w:tc>
+          <w:tcPr>
+            <w:tcW w:type="dxa" w:w="950"/>
+            <w:tcBorders>
+              <w:top w:val="single" w:color="999999" w:sz="4"/>
+              <w:left w:val="single" w:color="999999" w:sz="4"/>
+              <w:bottom w:val="single" w:color="999999" w:sz="4"/>
+              <w:right w:val="single" w:color="999999" w:sz="4"/>
+            </w:tcBorders>
+            <w:tcMar>
+              <w:top w:type="dxa" w:w="50"/>
+              <w:left w:type="dxa" w:w="90"/>
+              <w:bottom w:type="dxa" w:w="50"/>
+              <w:right w:type="dxa" w:w="90"/>
+            </w:tcMar>
+          </w:tcPr>
+          <w:p>
+            <w:pPr>
+              <w:jc w:val="center"/>
+            </w:pPr>
+            <w:r>
+              <w:rPr>
+                <w:rFonts w:ascii="Times New Roman" w:cs="Times New Roman" w:eastAsia="Times New Roman" w:hAnsi="Times New Roman"/>
+                <w:b/>
+                <w:bCs/>
+                <w:color w:val="12935A"/>
+                <w:sz w:val="24"/>
+                <w:szCs w:val="24"/>
+              </w:rPr>
+              <w:t xml:space="preserve"/>
+            </w:r>
+          </w:p>
+        </w:tc>
+        <w:tc>
+          <w:tcPr>
+            <w:tcW w:type="dxa" w:w="950"/>
+            <w:tcBorders>
+              <w:top w:val="single" w:color="999999" w:sz="4"/>
+              <w:left w:val="single" w:color="999999" w:sz="4"/>
+              <w:bottom w:val="single" w:color="999999" w:sz="4"/>
+              <w:right w:val="single" w:color="999999" w:sz="4"/>
+            </w:tcBorders>
+            <w:tcMar>
+              <w:top w:type="dxa" w:w="50"/>
+              <w:left w:type="dxa" w:w="90"/>
+              <w:bottom w:type="dxa" w:w="50"/>
+              <w:right w:type="dxa" w:w="90"/>
+            </w:tcMar>
+          </w:tcPr>
+          <w:p>
+            <w:pPr>
+              <w:jc w:val="center"/>
+            </w:pPr>
+            <w:r>
+              <w:rPr>
+                <w:rFonts w:ascii="Times New Roman" w:cs="Times New Roman" w:eastAsia="Times New Roman" w:hAnsi="Times New Roman"/>
+                <w:b/>
+                <w:bCs/>
+                <w:color w:val="12935A"/>
+                <w:sz w:val="24"/>
+                <w:szCs w:val="24"/>
+              </w:rPr>
+              <w:t xml:space="preserve">✓</w:t>
+            </w:r>
+          </w:p>
+        </w:tc>
+      </w:tr>
+      <w:tr>
+        <w:trPr>
+          <w:cantSplit/>
+        </w:trPr>
+        <w:tc>
+          <w:tcPr>
+            <w:tcW w:type="dxa" w:w="2500"/>
+            <w:tcBorders>
+              <w:top w:val="single" w:color="999999" w:sz="4"/>
+              <w:left w:val="single" w:color="999999" w:sz="4"/>
+              <w:bottom w:val="single" w:color="999999" w:sz="4"/>
+              <w:right w:val="single" w:color="999999" w:sz="4"/>
+            </w:tcBorders>
+            <w:tcMar>
+              <w:top w:type="dxa" w:w="50"/>
+              <w:left w:type="dxa" w:w="90"/>
+              <w:bottom w:type="dxa" w:w="50"/>
+              <w:right w:type="dxa" w:w="90"/>
+            </w:tcMar>
+          </w:tcPr>
+          <w:p>
+            <w:pPr>
+              <w:jc w:val="left"/>
+            </w:pPr>
+            <w:r>
+              <w:rPr>
+                <w:rFonts w:ascii="Times New Roman" w:cs="Times New Roman" w:eastAsia="Times New Roman" w:hAnsi="Times New Roman"/>
+                <w:b/>
+                <w:bCs/>
+                <w:sz w:val="21"/>
+                <w:szCs w:val="21"/>
+              </w:rPr>
+              <w:t xml:space="preserve">Đặt lại mật khẩu</w:t>
+            </w:r>
+          </w:p>
+        </w:tc>
+        <w:tc>
+          <w:tcPr>
+            <w:tcW w:type="dxa" w:w="4338"/>
+            <w:tcBorders>
+              <w:top w:val="single" w:color="999999" w:sz="4"/>
+              <w:left w:val="single" w:color="999999" w:sz="4"/>
+              <w:bottom w:val="single" w:color="999999" w:sz="4"/>
+              <w:right w:val="single" w:color="999999" w:sz="4"/>
+            </w:tcBorders>
+            <w:tcMar>
+              <w:top w:type="dxa" w:w="50"/>
+              <w:left w:type="dxa" w:w="90"/>
+              <w:bottom w:type="dxa" w:w="50"/>
+              <w:right w:type="dxa" w:w="90"/>
+            </w:tcMar>
+          </w:tcPr>
+          <w:p>
+            <w:pPr>
+              <w:jc w:val="left"/>
+            </w:pPr>
+            <w:r>
+              <w:rPr>
+                <w:rFonts w:ascii="Times New Roman" w:cs="Times New Roman" w:eastAsia="Times New Roman" w:hAnsi="Times New Roman"/>
+                <w:b w:val="false"/>
+                <w:bCs w:val="false"/>
+                <w:sz w:val="21"/>
+                <w:szCs w:val="21"/>
+              </w:rPr>
+              <w:t xml:space="preserve">Đặt lại mật khẩu cho mọi tài khoản khác khi quên.</w:t>
+            </w:r>
+          </w:p>
+        </w:tc>
+        <w:tc>
+          <w:tcPr>
+            <w:tcW w:type="dxa" w:w="900"/>
+            <w:tcBorders>
+              <w:top w:val="single" w:color="999999" w:sz="4"/>
+              <w:left w:val="single" w:color="999999" w:sz="4"/>
+              <w:bottom w:val="single" w:color="999999" w:sz="4"/>
+              <w:right w:val="single" w:color="999999" w:sz="4"/>
+            </w:tcBorders>
+            <w:tcMar>
+              <w:top w:type="dxa" w:w="50"/>
+              <w:left w:type="dxa" w:w="90"/>
+              <w:bottom w:type="dxa" w:w="50"/>
+              <w:right w:type="dxa" w:w="90"/>
+            </w:tcMar>
+          </w:tcPr>
+          <w:p>
+            <w:pPr>
+              <w:jc w:val="center"/>
+            </w:pPr>
+            <w:r>
+              <w:rPr>
+                <w:rFonts w:ascii="Times New Roman" w:cs="Times New Roman" w:eastAsia="Times New Roman" w:hAnsi="Times New Roman"/>
+                <w:b/>
+                <w:bCs/>
+                <w:color w:val="12935A"/>
+                <w:sz w:val="24"/>
+                <w:szCs w:val="24"/>
+              </w:rPr>
+              <w:t xml:space="preserve"/>
+            </w:r>
+          </w:p>
+        </w:tc>
+        <w:tc>
+          <w:tcPr>
+            <w:tcW w:type="dxa" w:w="950"/>
+            <w:tcBorders>
+              <w:top w:val="single" w:color="999999" w:sz="4"/>
+              <w:left w:val="single" w:color="999999" w:sz="4"/>
+              <w:bottom w:val="single" w:color="999999" w:sz="4"/>
+              <w:right w:val="single" w:color="999999" w:sz="4"/>
+            </w:tcBorders>
+            <w:tcMar>
+              <w:top w:type="dxa" w:w="50"/>
+              <w:left w:type="dxa" w:w="90"/>
+              <w:bottom w:type="dxa" w:w="50"/>
+              <w:right w:type="dxa" w:w="90"/>
+            </w:tcMar>
+          </w:tcPr>
+          <w:p>
+            <w:pPr>
+              <w:jc w:val="center"/>
+            </w:pPr>
+            <w:r>
+              <w:rPr>
+                <w:rFonts w:ascii="Times New Roman" w:cs="Times New Roman" w:eastAsia="Times New Roman" w:hAnsi="Times New Roman"/>
+                <w:b/>
+                <w:bCs/>
+                <w:color w:val="12935A"/>
+                <w:sz w:val="24"/>
+                <w:szCs w:val="24"/>
+              </w:rPr>
+              <w:t xml:space="preserve"/>
+            </w:r>
+          </w:p>
+        </w:tc>
+        <w:tc>
+          <w:tcPr>
+            <w:tcW w:type="dxa" w:w="950"/>
+            <w:tcBorders>
+              <w:top w:val="single" w:color="999999" w:sz="4"/>
+              <w:left w:val="single" w:color="999999" w:sz="4"/>
+              <w:bottom w:val="single" w:color="999999" w:sz="4"/>
+              <w:right w:val="single" w:color="999999" w:sz="4"/>
+            </w:tcBorders>
+            <w:tcMar>
+              <w:top w:type="dxa" w:w="50"/>
+              <w:left w:type="dxa" w:w="90"/>
+              <w:bottom w:type="dxa" w:w="50"/>
+              <w:right w:type="dxa" w:w="90"/>
+            </w:tcMar>
+          </w:tcPr>
+          <w:p>
+            <w:pPr>
+              <w:jc w:val="center"/>
+            </w:pPr>
+            <w:r>
+              <w:rPr>
+                <w:rFonts w:ascii="Times New Roman" w:cs="Times New Roman" w:eastAsia="Times New Roman" w:hAnsi="Times New Roman"/>
+                <w:b/>
+                <w:bCs/>
+                <w:color w:val="12935A"/>
+                <w:sz w:val="24"/>
+                <w:szCs w:val="24"/>
+              </w:rPr>
+              <w:t xml:space="preserve">✓</w:t>
+            </w:r>
+          </w:p>
+        </w:tc>
+      </w:tr>
+      <w:tr>
+        <w:trPr>
+          <w:cantSplit/>
+        </w:trPr>
+        <w:tc>
+          <w:tcPr>
+            <w:tcW w:type="dxa" w:w="2500"/>
+            <w:tcBorders>
+              <w:top w:val="single" w:color="999999" w:sz="4"/>
+              <w:left w:val="single" w:color="999999" w:sz="4"/>
+              <w:bottom w:val="single" w:color="999999" w:sz="4"/>
+              <w:right w:val="single" w:color="999999" w:sz="4"/>
+            </w:tcBorders>
+            <w:tcMar>
+              <w:top w:type="dxa" w:w="50"/>
+              <w:left w:type="dxa" w:w="90"/>
+              <w:bottom w:type="dxa" w:w="50"/>
+              <w:right w:type="dxa" w:w="90"/>
+            </w:tcMar>
+          </w:tcPr>
+          <w:p>
+            <w:pPr>
+              <w:jc w:val="left"/>
+            </w:pPr>
+            <w:r>
+              <w:rPr>
+                <w:rFonts w:ascii="Times New Roman" w:cs="Times New Roman" w:eastAsia="Times New Roman" w:hAnsi="Times New Roman"/>
+                <w:b/>
+                <w:bCs/>
+                <w:sz w:val="21"/>
+                <w:szCs w:val="21"/>
+              </w:rPr>
+              <w:t xml:space="preserve">Cấu hình</w:t>
+            </w:r>
+          </w:p>
+        </w:tc>
+        <w:tc>
+          <w:tcPr>
+            <w:tcW w:type="dxa" w:w="4338"/>
+            <w:tcBorders>
+              <w:top w:val="single" w:color="999999" w:sz="4"/>
+              <w:left w:val="single" w:color="999999" w:sz="4"/>
+              <w:bottom w:val="single" w:color="999999" w:sz="4"/>
+              <w:right w:val="single" w:color="999999" w:sz="4"/>
+            </w:tcBorders>
+            <w:tcMar>
+              <w:top w:type="dxa" w:w="50"/>
+              <w:left w:type="dxa" w:w="90"/>
+              <w:bottom w:type="dxa" w:w="50"/>
+              <w:right w:type="dxa" w:w="90"/>
+            </w:tcMar>
+          </w:tcPr>
+          <w:p>
+            <w:pPr>
+              <w:jc w:val="left"/>
+            </w:pPr>
+            <w:r>
+              <w:rPr>
+                <w:rFonts w:ascii="Times New Roman" w:cs="Times New Roman" w:eastAsia="Times New Roman" w:hAnsi="Times New Roman"/>
+                <w:b w:val="false"/>
+                <w:bCs w:val="false"/>
+                <w:sz w:val="21"/>
+                <w:szCs w:val="21"/>
+              </w:rPr>
+              <w:t xml:space="preserve">Đổi ngưỡng điểm, trần ghi sổ, học kỳ, năm học, thêm môn học riêng của trường (vd Tiếng Nhật)…; số liệu tự cập nhật theo.</w:t>
             </w:r>
           </w:p>
         </w:tc>

</xml_diff>